<commit_message>
Add code and output screenshots to Exp 9 document
Co-Authored-By: Claude Sonnet 5.5 <noreply@anthropic.com>
Claude-Session: https://claude.ai/code/session_01GhJWoqZNzrTZrEyV694Tti
</commit_message>
<xml_diff>
--- a/os_exp9/EXP9_B106.docx
+++ b/os_exp9/EXP9_B106.docx
@@ -2701,6 +2701,77 @@
           <w:b/>
           <w:sz w:val="20"/>
         </w:rPr>
+        <w:t>Code Screenshot:</w:t>
+      </w:r>
+    </w:p>
+    <w:p>
+      <w:pPr>
+        <w:pStyle w:val="Heading2"/>
+        <w:spacing w:before="0" w:after="0"/>
+        <w:ind w:hanging="0" w:start="0"/>
+        <w:rPr>
+          <w:bCs w:val="false"/>
+          <w:sz w:val="24"/>
+          <w:szCs w:val="24"/>
+        </w:rPr>
+      </w:pPr>
+      <w:r>
+        <w:rPr>
+          <w:rFonts w:ascii="Times New Roman" w:hAnsi="Times New Roman"/>
+          <w:b w:val="0"/>
+          <w:sz w:val="20"/>
+        </w:rPr>
+        <w:drawing>
+          <wp:inline xmlns:a="http://schemas.openxmlformats.org/drawingml/2006/main" xmlns:pic="http://schemas.openxmlformats.org/drawingml/2006/picture">
+            <wp:extent cx="5486400" cy="4641494"/>
+            <wp:docPr id="3" name="Picture 3"/>
+            <wp:cNvGraphicFramePr>
+              <a:graphicFrameLocks noChangeAspect="1"/>
+            </wp:cNvGraphicFramePr>
+            <a:graphic>
+              <a:graphicData uri="http://schemas.openxmlformats.org/drawingml/2006/picture">
+                <pic:pic>
+                  <pic:nvPicPr>
+                    <pic:cNvPr id="0" name="s1.png"/>
+                    <pic:cNvPicPr/>
+                  </pic:nvPicPr>
+                  <pic:blipFill>
+                    <a:blip r:embed="rId9"/>
+                    <a:stretch>
+                      <a:fillRect/>
+                    </a:stretch>
+                  </pic:blipFill>
+                  <pic:spPr>
+                    <a:xfrm>
+                      <a:off x="0" y="0"/>
+                      <a:ext cx="5486400" cy="4641494"/>
+                    </a:xfrm>
+                    <a:prstGeom prst="rect"/>
+                  </pic:spPr>
+                </pic:pic>
+              </a:graphicData>
+            </a:graphic>
+          </wp:inline>
+        </w:drawing>
+      </w:r>
+    </w:p>
+    <w:p>
+      <w:pPr>
+        <w:pStyle w:val="Heading2"/>
+        <w:spacing w:before="0" w:after="0"/>
+        <w:ind w:hanging="0" w:start="0"/>
+        <w:rPr>
+          <w:bCs w:val="false"/>
+          <w:sz w:val="24"/>
+          <w:szCs w:val="24"/>
+        </w:rPr>
+      </w:pPr>
+      <w:r>
+        <w:rPr>
+          <w:rFonts w:ascii="Times New Roman" w:hAnsi="Times New Roman"/>
+          <w:b/>
+          <w:sz w:val="20"/>
+        </w:rPr>
         <w:t>Output:</w:t>
       </w:r>
     </w:p>
@@ -4357,6 +4428,128 @@
           <w:b w:val="0"/>
           <w:sz w:val="20"/>
         </w:rPr>
+      </w:r>
+    </w:p>
+    <w:p>
+      <w:pPr>
+        <w:pStyle w:val="Heading2"/>
+        <w:spacing w:before="0" w:after="0"/>
+        <w:ind w:hanging="0" w:start="0"/>
+        <w:rPr>
+          <w:bCs w:val="false"/>
+          <w:sz w:val="24"/>
+          <w:szCs w:val="24"/>
+        </w:rPr>
+      </w:pPr>
+      <w:r>
+        <w:rPr>
+          <w:rFonts w:ascii="Times New Roman" w:hAnsi="Times New Roman"/>
+          <w:b/>
+          <w:sz w:val="20"/>
+        </w:rPr>
+        <w:t>Output Screenshot:</w:t>
+      </w:r>
+    </w:p>
+    <w:p>
+      <w:pPr>
+        <w:pStyle w:val="Heading2"/>
+        <w:spacing w:before="0" w:after="0"/>
+        <w:ind w:hanging="0" w:start="0"/>
+        <w:rPr>
+          <w:bCs w:val="false"/>
+          <w:sz w:val="24"/>
+          <w:szCs w:val="24"/>
+        </w:rPr>
+      </w:pPr>
+      <w:r>
+        <w:rPr>
+          <w:rFonts w:ascii="Times New Roman" w:hAnsi="Times New Roman"/>
+          <w:b w:val="0"/>
+          <w:sz w:val="20"/>
+        </w:rPr>
+        <w:drawing>
+          <wp:inline xmlns:a="http://schemas.openxmlformats.org/drawingml/2006/main" xmlns:pic="http://schemas.openxmlformats.org/drawingml/2006/picture">
+            <wp:extent cx="5120640" cy="4147718"/>
+            <wp:docPr id="4" name="Picture 4"/>
+            <wp:cNvGraphicFramePr>
+              <a:graphicFrameLocks noChangeAspect="1"/>
+            </wp:cNvGraphicFramePr>
+            <a:graphic>
+              <a:graphicData uri="http://schemas.openxmlformats.org/drawingml/2006/picture">
+                <pic:pic>
+                  <pic:nvPicPr>
+                    <pic:cNvPr id="0" name="s3.png"/>
+                    <pic:cNvPicPr/>
+                  </pic:nvPicPr>
+                  <pic:blipFill>
+                    <a:blip r:embed="rId10"/>
+                    <a:stretch>
+                      <a:fillRect/>
+                    </a:stretch>
+                  </pic:blipFill>
+                  <pic:spPr>
+                    <a:xfrm>
+                      <a:off x="0" y="0"/>
+                      <a:ext cx="5120640" cy="4147718"/>
+                    </a:xfrm>
+                    <a:prstGeom prst="rect"/>
+                  </pic:spPr>
+                </pic:pic>
+              </a:graphicData>
+            </a:graphic>
+          </wp:inline>
+        </w:drawing>
+      </w:r>
+    </w:p>
+    <w:p>
+      <w:pPr>
+        <w:pStyle w:val="Heading2"/>
+        <w:spacing w:before="0" w:after="0"/>
+        <w:ind w:hanging="0" w:start="0"/>
+        <w:rPr>
+          <w:bCs w:val="false"/>
+          <w:sz w:val="24"/>
+          <w:szCs w:val="24"/>
+        </w:rPr>
+      </w:pPr>
+      <w:r>
+        <w:rPr>
+          <w:rFonts w:ascii="Times New Roman" w:hAnsi="Times New Roman"/>
+          <w:b w:val="0"/>
+          <w:sz w:val="20"/>
+        </w:rPr>
+        <w:drawing>
+          <wp:inline xmlns:a="http://schemas.openxmlformats.org/drawingml/2006/main" xmlns:pic="http://schemas.openxmlformats.org/drawingml/2006/picture">
+            <wp:extent cx="5120640" cy="1966326"/>
+            <wp:docPr id="5" name="Picture 5"/>
+            <wp:cNvGraphicFramePr>
+              <a:graphicFrameLocks noChangeAspect="1"/>
+            </wp:cNvGraphicFramePr>
+            <a:graphic>
+              <a:graphicData uri="http://schemas.openxmlformats.org/drawingml/2006/picture">
+                <pic:pic>
+                  <pic:nvPicPr>
+                    <pic:cNvPr id="0" name="s2.png"/>
+                    <pic:cNvPicPr/>
+                  </pic:nvPicPr>
+                  <pic:blipFill>
+                    <a:blip r:embed="rId11"/>
+                    <a:stretch>
+                      <a:fillRect/>
+                    </a:stretch>
+                  </pic:blipFill>
+                  <pic:spPr>
+                    <a:xfrm>
+                      <a:off x="0" y="0"/>
+                      <a:ext cx="5120640" cy="1966326"/>
+                    </a:xfrm>
+                    <a:prstGeom prst="rect"/>
+                  </pic:spPr>
+                </pic:pic>
+              </a:graphicData>
+            </a:graphic>
+          </wp:inline>
+        </w:drawing>
       </w:r>
     </w:p>
     <w:p>

</xml_diff>